<commit_message>
fix: remove broken watermark image, enforce Microsoft Word engine for PDF conversion, and clean all docx templates
</commit_message>
<xml_diff>
--- a/frontend/public/templates/bank_guarantee_letter_template.docx
+++ b/frontend/public/templates/bank_guarantee_letter_template.docx
@@ -2528,31 +2528,6 @@
       <w:rPr>
         <w:noProof/>
       </w:rPr>
-      <w:pict w14:anchorId="0B9A1BD8">
-        <v:shapetype id="_x0000_t75" coordsize="21600,21600" o:spt="75" o:preferrelative="t" path="m@4@5l@4@11@9@11@9@5xe" filled="f" stroked="f">
-          <v:stroke joinstyle="miter"/>
-          <v:formulas>
-            <v:f eqn="if lineDrawn pixelLineWidth 0"/>
-            <v:f eqn="sum @0 1 0"/>
-            <v:f eqn="sum 0 0 @1"/>
-            <v:f eqn="prod @2 1 2"/>
-            <v:f eqn="prod @3 21600 pixelWidth"/>
-            <v:f eqn="prod @3 21600 pixelHeight"/>
-            <v:f eqn="sum @0 0 1"/>
-            <v:f eqn="prod @6 1 2"/>
-            <v:f eqn="prod @7 21600 pixelWidth"/>
-            <v:f eqn="sum @8 21600 0"/>
-            <v:f eqn="prod @7 21600 pixelHeight"/>
-            <v:f eqn="sum @10 21600 0"/>
-          </v:formulas>
-          <v:path o:extrusionok="f" gradientshapeok="t" o:connecttype="rect"/>
-          <o:lock v:ext="edit" aspectratio="t"/>
-        </v:shapetype>
-        <v:shape id="WordPictureWatermark10348436" o:spid="_x0000_s1029" type="#_x0000_t75" style="position:absolute;left:0;text-align:left;margin-left:0;margin-top:0;width:493.95pt;height:399.45pt;z-index:-251658240;mso-position-horizontal:center;mso-position-horizontal-relative:margin;mso-position-vertical:center;mso-position-vertical-relative:margin" o:allowincell="f">
-          <v:imagedata r:id="rId1" o:title="لوجو جديد" gain="19661f" blacklevel="22938f"/>
-          <w10:wrap anchorx="margin" anchory="margin"/>
-        </v:shape>
-      </w:pict>
     </w:r>
   </w:p>
 </w:hdr>
@@ -3299,31 +3274,6 @@
       <w:rPr>
         <w:noProof/>
       </w:rPr>
-      <w:pict w14:anchorId="322AF0D5">
-        <v:shapetype id="_x0000_t75" coordsize="21600,21600" o:spt="75" o:preferrelative="t" path="m@4@5l@4@11@9@11@9@5xe" filled="f" stroked="f">
-          <v:stroke joinstyle="miter"/>
-          <v:formulas>
-            <v:f eqn="if lineDrawn pixelLineWidth 0"/>
-            <v:f eqn="sum @0 1 0"/>
-            <v:f eqn="sum 0 0 @1"/>
-            <v:f eqn="prod @2 1 2"/>
-            <v:f eqn="prod @3 21600 pixelWidth"/>
-            <v:f eqn="prod @3 21600 pixelHeight"/>
-            <v:f eqn="sum @0 0 1"/>
-            <v:f eqn="prod @6 1 2"/>
-            <v:f eqn="prod @7 21600 pixelWidth"/>
-            <v:f eqn="sum @8 21600 0"/>
-            <v:f eqn="prod @7 21600 pixelHeight"/>
-            <v:f eqn="sum @10 21600 0"/>
-          </v:formulas>
-          <v:path o:extrusionok="f" gradientshapeok="t" o:connecttype="rect"/>
-          <o:lock v:ext="edit" aspectratio="t"/>
-        </v:shapetype>
-        <v:shape id="WordPictureWatermark10348437" o:spid="_x0000_s1030" type="#_x0000_t75" style="position:absolute;left:0;text-align:left;margin-left:-6.15pt;margin-top:188.85pt;width:493.95pt;height:399.45pt;z-index:-251657216;mso-position-horizontal-relative:margin;mso-position-vertical-relative:margin" o:allowincell="f">
-          <v:imagedata r:id="rId2" o:title="لوجو جديد" gain="19661f" blacklevel="22938f"/>
-          <w10:wrap anchorx="margin" anchory="margin"/>
-        </v:shape>
-      </w:pict>
     </w:r>
   </w:p>
 </w:hdr>
@@ -3339,31 +3289,6 @@
       <w:rPr>
         <w:noProof/>
       </w:rPr>
-      <w:pict w14:anchorId="3465DA2B">
-        <v:shapetype id="_x0000_t75" coordsize="21600,21600" o:spt="75" o:preferrelative="t" path="m@4@5l@4@11@9@11@9@5xe" filled="f" stroked="f">
-          <v:stroke joinstyle="miter"/>
-          <v:formulas>
-            <v:f eqn="if lineDrawn pixelLineWidth 0"/>
-            <v:f eqn="sum @0 1 0"/>
-            <v:f eqn="sum 0 0 @1"/>
-            <v:f eqn="prod @2 1 2"/>
-            <v:f eqn="prod @3 21600 pixelWidth"/>
-            <v:f eqn="prod @3 21600 pixelHeight"/>
-            <v:f eqn="sum @0 0 1"/>
-            <v:f eqn="prod @6 1 2"/>
-            <v:f eqn="prod @7 21600 pixelWidth"/>
-            <v:f eqn="sum @8 21600 0"/>
-            <v:f eqn="prod @7 21600 pixelHeight"/>
-            <v:f eqn="sum @10 21600 0"/>
-          </v:formulas>
-          <v:path o:extrusionok="f" gradientshapeok="t" o:connecttype="rect"/>
-          <o:lock v:ext="edit" aspectratio="t"/>
-        </v:shapetype>
-        <v:shape id="WordPictureWatermark10348435" o:spid="_x0000_s1028" type="#_x0000_t75" style="position:absolute;left:0;text-align:left;margin-left:0;margin-top:0;width:493.95pt;height:399.45pt;z-index:-251659264;mso-position-horizontal:center;mso-position-horizontal-relative:margin;mso-position-vertical:center;mso-position-vertical-relative:margin" o:allowincell="f">
-          <v:imagedata r:id="rId1" o:title="لوجو جديد" gain="19661f" blacklevel="22938f"/>
-          <w10:wrap anchorx="margin" anchory="margin"/>
-        </v:shape>
-      </w:pict>
     </w:r>
   </w:p>
 </w:hdr>

</xml_diff>

<commit_message>
fix(templates): preserve Word templates layout, font fidelity and separate chairman signature lines
</commit_message>
<xml_diff>
--- a/frontend/public/templates/bank_guarantee_letter_template.docx
+++ b/frontend/public/templates/bank_guarantee_letter_template.docx
@@ -289,7 +289,7 @@
         </w:tabs>
         <w:spacing w:after="0"/>
         <w:ind w:left="-567"/>
-        <w:jc w:val="highKashida"/>
+        <w:jc w:val="both"/>
         <w:rPr>
           <w:rFonts w:ascii="Arabic Typesetting" w:hAnsi="Arabic Typesetting" w:cs="Arabic Typesetting"/>
           <w:b/>
@@ -650,7 +650,7 @@
       <w:pPr>
         <w:spacing w:after="0" w:line="240" w:lineRule="auto"/>
         <w:ind w:left="-567" w:hanging="283"/>
-        <w:jc w:val="highKashida"/>
+        <w:jc w:val="both"/>
         <w:rPr>
           <w:b/>
           <w:bCs/>
@@ -1884,7 +1884,7 @@
       <w:pPr>
         <w:spacing w:after="0" w:line="240" w:lineRule="auto"/>
         <w:ind w:left="-567" w:hanging="283"/>
-        <w:jc w:val="highKashida"/>
+        <w:jc w:val="both"/>
         <w:rPr>
           <w:b/>
           <w:bCs/>
@@ -1975,7 +1975,7 @@
       <w:pPr>
         <w:spacing w:after="0" w:line="240" w:lineRule="auto"/>
         <w:ind w:left="-567" w:hanging="283"/>
-        <w:jc w:val="highKashida"/>
+        <w:jc w:val="both"/>
         <w:rPr>
           <w:b/>
           <w:bCs/>

</xml_diff>